<commit_message>
feat(models): swap the drum stand for the converted glb, as requested
Wires models/huzuoniaojiagu.glb into the drum exhibit. The procedural shapeDrum stays on as the size and position placeholder, and the loaded scene is normalised to its height with its base on y = 0, so the pedestal height and the interactable reference are unchanged.

The model measures 1.60 x 1.48 x 0.56 in world units and stands upright, so no rotation offset is needed. Note the widest axis is X for this object, unlike the vase where the height is the largest dimension.

The glb carries four textures and GLTFLoader's blob path failed for all of them here. The previous fallback grabbed only the first image and handed it to every material, so three parts would have shown the wrong pattern; it now extracts every embedded image and assigns them to the map-less materials in order (11 material slots, 4 distinct textures).
</commit_message>
<xml_diff>
--- a/report/数媒2304zb罗奕嵩 任务书.docx
+++ b/report/数媒2304zb罗奕嵩 任务书.docx
@@ -7,7 +7,7 @@
         <w:pStyle w:val="a4"/>
         <w:jc w:val="center"/>
         <w:rPr>
-          <w:rFonts w:ascii="华文行楷" w:eastAsia="华文行楷"/>
+          <w:rFonts w:ascii="华文行楷" w:eastAsia="华文行楷" w:hint="eastAsia"/>
           <w:b/>
           <w:bCs/>
           <w:sz w:val="72"/>
@@ -566,7 +566,7 @@
         <w:pStyle w:val="a4"/>
         <w:jc w:val="center"/>
         <w:rPr>
-          <w:rFonts w:ascii="华文行楷" w:eastAsia="华文行楷" w:hint="eastAsia"/>
+          <w:rFonts w:ascii="华文行楷" w:eastAsia="华文行楷"/>
           <w:b/>
           <w:bCs/>
           <w:sz w:val="72"/>
@@ -722,18 +722,7 @@
           <w:szCs w:val="20"/>
           <w:u w:val="single"/>
         </w:rPr>
-        <w:t>论文撰写要求思路清晰、内容充实、论点明确、论据充分、语言通顺、逻辑严谨。撰写论文前应系统研读虚拟博物馆、数字展陈、Web3D 交互与文化遗产数字化等领域的研究资料，精准把握湖北省博物馆馆藏的文化内核与楚文化的视觉特征，紧跟数字博物馆、沉浸式体验设计的前沿动态，夯实专业理论功底，提升论文的文化深度与学术水平。设计实践要求空间布局与参观动线合理、器物比例准确、材质与光影统一、界面清晰易用，展品陈列不穿模、不闪烁，交互反馈及时，并能在普通配置的电脑上流畅运行。根据开题报告框架、中期检查意见及指导老师的修改建议，反复打磨论文内容、完善设计方案、规范论证逻辑，严格遵照论文进度安排推进写作、修改与定稿工作，按时参加毕业论文开题答辩、</w:t>
-      </w:r>
-      <w:bookmarkStart w:id="0" w:name="_GoBack"/>
-      <w:bookmarkEnd w:id="0"/>
-      <w:r>
-        <w:rPr>
-          <w:rFonts w:hint="eastAsia"/>
-          <w:sz w:val="24"/>
-          <w:szCs w:val="20"/>
-          <w:u w:val="single"/>
-        </w:rPr>
-        <w:t>中期考核与最终答辩。论文的格式规范、字数要求、参考文献标注、图表排版等撰写细节，严格参照学校本科毕业论文格式标准执行，确保论文体例规范、内容完整、贴合</w:t>
+        <w:t>论文撰写要求思路清晰、内容充实、论点明确、论据充分、语言通顺、逻辑严谨。撰写论文前应系统研读虚拟博物馆、数字展陈、Web3D 交互与文化遗产数字化等领域的研究资料，精准把握湖北省博物馆馆藏的文化内核与楚文化的视觉特征，紧跟数字博物馆、沉浸式体验设计的前沿动态，夯实专业理论功底，提升论文的文化深度与学术水平。设计实践要求空间布局与参观动线合理、器物比例准确、材质与光影统一、界面清晰易用，展品陈列不穿模、不闪烁，交互反馈及时，并能在普通配置的电脑上流畅运行。根据开题报告框架、中期检查意见及指导老师的修改建议，反复打磨论文内容、完善设计方案、规范论证逻辑，严格遵照论文进度安排推进写作、修改与定稿工作，按时参加毕业论文开题答辩、中期考核与最终答辩。论文的格式规范、字数要求、参考文献标注、图表排版等撰写细节，严格参照学校本科毕业论文格式标准执行，确保论文体例规范、内容完整、贴合</w:t>
       </w:r>
       <w:r>
         <w:rPr>
@@ -1298,7 +1287,37 @@
                 <w:sz w:val="24"/>
                 <w:szCs w:val="24"/>
               </w:rPr>
-              <w:t>1.2025.06.01-2025.09.10——确定毕业设计选题，然后按要求在指导老师的指导下开始毕业论文(设计)工作。</w:t>
+              <w:t>1.202</w:t>
+            </w:r>
+            <w:r>
+              <w:rPr>
+                <w:sz w:val="24"/>
+                <w:szCs w:val="24"/>
+              </w:rPr>
+              <w:t>6</w:t>
+            </w:r>
+            <w:r>
+              <w:rPr>
+                <w:rFonts w:hint="eastAsia"/>
+                <w:sz w:val="24"/>
+                <w:szCs w:val="24"/>
+              </w:rPr>
+              <w:t>.06.01-202</w:t>
+            </w:r>
+            <w:r>
+              <w:rPr>
+                <w:sz w:val="24"/>
+                <w:szCs w:val="24"/>
+              </w:rPr>
+              <w:t>6</w:t>
+            </w:r>
+            <w:r>
+              <w:rPr>
+                <w:rFonts w:hint="eastAsia"/>
+                <w:sz w:val="24"/>
+                <w:szCs w:val="24"/>
+              </w:rPr>
+              <w:t>.09.10——确定毕业设计选题，然后按要求在指导老师的指导下开始毕业论文(设计)工作。</w:t>
             </w:r>
           </w:p>
           <w:p>
@@ -1316,7 +1335,37 @@
                 <w:sz w:val="24"/>
                 <w:szCs w:val="24"/>
               </w:rPr>
-              <w:t>2.2025.09.11-2025.10.10——指导教师下发任务书，基于任务书，开始查阅论文相关文献资料和熟悉课题。</w:t>
+              <w:t>2.202</w:t>
+            </w:r>
+            <w:r>
+              <w:rPr>
+                <w:sz w:val="24"/>
+                <w:szCs w:val="24"/>
+              </w:rPr>
+              <w:t>6</w:t>
+            </w:r>
+            <w:r>
+              <w:rPr>
+                <w:rFonts w:hint="eastAsia"/>
+                <w:sz w:val="24"/>
+                <w:szCs w:val="24"/>
+              </w:rPr>
+              <w:t>.09.11-202</w:t>
+            </w:r>
+            <w:r>
+              <w:rPr>
+                <w:sz w:val="24"/>
+                <w:szCs w:val="24"/>
+              </w:rPr>
+              <w:t>6</w:t>
+            </w:r>
+            <w:r>
+              <w:rPr>
+                <w:rFonts w:hint="eastAsia"/>
+                <w:sz w:val="24"/>
+                <w:szCs w:val="24"/>
+              </w:rPr>
+              <w:t>.10.10——指导教师下发任务书，基于任务书，开始查阅论文相关文献资料和熟悉课题。</w:t>
             </w:r>
           </w:p>
           <w:p>
@@ -1334,7 +1383,37 @@
                 <w:sz w:val="24"/>
                 <w:szCs w:val="24"/>
               </w:rPr>
-              <w:t>3.2025.10.11-2025.10.28——拟定开题报告和文献综述等，并经过论文指导老师修订完成后报院专业审查小组认可，学院毕业论文工作委员会进行审定，参与开题报告会，确定开题。</w:t>
+              <w:t>3.202</w:t>
+            </w:r>
+            <w:r>
+              <w:rPr>
+                <w:sz w:val="24"/>
+                <w:szCs w:val="24"/>
+              </w:rPr>
+              <w:t>6</w:t>
+            </w:r>
+            <w:r>
+              <w:rPr>
+                <w:rFonts w:hint="eastAsia"/>
+                <w:sz w:val="24"/>
+                <w:szCs w:val="24"/>
+              </w:rPr>
+              <w:t>.10.11-202</w:t>
+            </w:r>
+            <w:r>
+              <w:rPr>
+                <w:sz w:val="24"/>
+                <w:szCs w:val="24"/>
+              </w:rPr>
+              <w:t>6</w:t>
+            </w:r>
+            <w:r>
+              <w:rPr>
+                <w:rFonts w:hint="eastAsia"/>
+                <w:sz w:val="24"/>
+                <w:szCs w:val="24"/>
+              </w:rPr>
+              <w:t>.10.28——拟定开题报告和文献综述等，并经过论文指导老师修订完成后报院专业审查小组认可，学院毕业论文工作委员会进行审定，参与开题报告会，确定开题。</w:t>
             </w:r>
           </w:p>
           <w:p>
@@ -1352,7 +1431,37 @@
                 <w:sz w:val="24"/>
                 <w:szCs w:val="24"/>
               </w:rPr>
-              <w:t>4.2025.10.29-2025.12.31——在指导老师指导下，围绕湖北省博物馆馆藏资源与虚拟展厅设计开展调研，收集展厅平面资料、文物图像与同类虚拟展陈案例，完成课题调研部分。</w:t>
+              <w:t>4.202</w:t>
+            </w:r>
+            <w:r>
+              <w:rPr>
+                <w:sz w:val="24"/>
+                <w:szCs w:val="24"/>
+              </w:rPr>
+              <w:t>6</w:t>
+            </w:r>
+            <w:r>
+              <w:rPr>
+                <w:rFonts w:hint="eastAsia"/>
+                <w:sz w:val="24"/>
+                <w:szCs w:val="24"/>
+              </w:rPr>
+              <w:t>.10.29-202</w:t>
+            </w:r>
+            <w:r>
+              <w:rPr>
+                <w:sz w:val="24"/>
+                <w:szCs w:val="24"/>
+              </w:rPr>
+              <w:t>6</w:t>
+            </w:r>
+            <w:r>
+              <w:rPr>
+                <w:rFonts w:hint="eastAsia"/>
+                <w:sz w:val="24"/>
+                <w:szCs w:val="24"/>
+              </w:rPr>
+              <w:t>.12.31——在指导老师指导下，围绕湖北省博物馆馆藏资源与虚拟展厅设计开展调研，收集展厅平面资料、文物图像与同类虚拟展陈案例，完成课题调研部分。</w:t>
             </w:r>
           </w:p>
           <w:p>
@@ -1370,7 +1479,37 @@
                 <w:sz w:val="24"/>
                 <w:szCs w:val="24"/>
               </w:rPr>
-              <w:t>5.2026.1.1-2026.1.31——将资料整合，确定虚拟展厅的空间布局与视觉方案，完成主要展厅的设计与程序实现，在指导老师指导下完成论文初稿。</w:t>
+              <w:t>5.202</w:t>
+            </w:r>
+            <w:r>
+              <w:rPr>
+                <w:sz w:val="24"/>
+                <w:szCs w:val="24"/>
+              </w:rPr>
+              <w:t>7</w:t>
+            </w:r>
+            <w:r>
+              <w:rPr>
+                <w:rFonts w:hint="eastAsia"/>
+                <w:sz w:val="24"/>
+                <w:szCs w:val="24"/>
+              </w:rPr>
+              <w:t>.1.1-202</w:t>
+            </w:r>
+            <w:r>
+              <w:rPr>
+                <w:sz w:val="24"/>
+                <w:szCs w:val="24"/>
+              </w:rPr>
+              <w:t>7</w:t>
+            </w:r>
+            <w:r>
+              <w:rPr>
+                <w:rFonts w:hint="eastAsia"/>
+                <w:sz w:val="24"/>
+                <w:szCs w:val="24"/>
+              </w:rPr>
+              <w:t>.1.31——将资料整合，确定虚拟展厅的空间布局与视觉方案，完成主要展厅的设计与程序实现，在指导老师指导下完成论文初稿。</w:t>
             </w:r>
           </w:p>
           <w:p>
@@ -1389,7 +1528,37 @@
                 <w:szCs w:val="24"/>
               </w:rPr>
               <w:lastRenderedPageBreak/>
-              <w:t>6.2026.2.1-2026.2.15——根据指导老师的修改意见，完善交互功能与展品细节，修改论文，撰写论文期中检查表。</w:t>
+              <w:t>6.202</w:t>
+            </w:r>
+            <w:r>
+              <w:rPr>
+                <w:sz w:val="24"/>
+                <w:szCs w:val="24"/>
+              </w:rPr>
+              <w:t>7</w:t>
+            </w:r>
+            <w:r>
+              <w:rPr>
+                <w:rFonts w:hint="eastAsia"/>
+                <w:sz w:val="24"/>
+                <w:szCs w:val="24"/>
+              </w:rPr>
+              <w:t>.2.1-202</w:t>
+            </w:r>
+            <w:r>
+              <w:rPr>
+                <w:sz w:val="24"/>
+                <w:szCs w:val="24"/>
+              </w:rPr>
+              <w:t>7</w:t>
+            </w:r>
+            <w:r>
+              <w:rPr>
+                <w:rFonts w:hint="eastAsia"/>
+                <w:sz w:val="24"/>
+                <w:szCs w:val="24"/>
+              </w:rPr>
+              <w:t>.2.15——根据指导老师的修改意见，完善交互功能与展品细节，修改论文，撰写论文期中检查表。</w:t>
             </w:r>
           </w:p>
           <w:p>
@@ -1407,7 +1576,37 @@
                 <w:sz w:val="24"/>
                 <w:szCs w:val="24"/>
               </w:rPr>
-              <w:t>7.2026.2.16-2026.3.20——根据老师的指导意见修改论文并按照湖北大学知行学院本科毕业论文文本规范修改论文格式，符合规范后，交给论文指导老师检查，基本确立论文全稿。</w:t>
+              <w:t>7.202</w:t>
+            </w:r>
+            <w:r>
+              <w:rPr>
+                <w:sz w:val="24"/>
+                <w:szCs w:val="24"/>
+              </w:rPr>
+              <w:t>7</w:t>
+            </w:r>
+            <w:r>
+              <w:rPr>
+                <w:rFonts w:hint="eastAsia"/>
+                <w:sz w:val="24"/>
+                <w:szCs w:val="24"/>
+              </w:rPr>
+              <w:t>.2.16-202</w:t>
+            </w:r>
+            <w:r>
+              <w:rPr>
+                <w:sz w:val="24"/>
+                <w:szCs w:val="24"/>
+              </w:rPr>
+              <w:t>7</w:t>
+            </w:r>
+            <w:r>
+              <w:rPr>
+                <w:rFonts w:hint="eastAsia"/>
+                <w:sz w:val="24"/>
+                <w:szCs w:val="24"/>
+              </w:rPr>
+              <w:t>.3.20——根据老师的指导意见修改论文并按照湖北大学知行学院本科毕业论文文本规范修改论文格式，符合规范后，交给论文指导老师检查，基本确立论文全稿。</w:t>
             </w:r>
           </w:p>
           <w:p>
@@ -1425,7 +1624,37 @@
                 <w:sz w:val="24"/>
                 <w:szCs w:val="24"/>
               </w:rPr>
-              <w:t>8.2026.3.12-2026.03.31——完成论文定稿,自己在维普查重，文字重复率小于20%的论文可以参加答辩，并将所有与毕业论文有关的资料交给指导老师。</w:t>
+              <w:t>8.202</w:t>
+            </w:r>
+            <w:r>
+              <w:rPr>
+                <w:sz w:val="24"/>
+                <w:szCs w:val="24"/>
+              </w:rPr>
+              <w:t>7</w:t>
+            </w:r>
+            <w:r>
+              <w:rPr>
+                <w:rFonts w:hint="eastAsia"/>
+                <w:sz w:val="24"/>
+                <w:szCs w:val="24"/>
+              </w:rPr>
+              <w:t>.3.12-202</w:t>
+            </w:r>
+            <w:r>
+              <w:rPr>
+                <w:sz w:val="24"/>
+                <w:szCs w:val="24"/>
+              </w:rPr>
+              <w:t>7</w:t>
+            </w:r>
+            <w:r>
+              <w:rPr>
+                <w:rFonts w:hint="eastAsia"/>
+                <w:sz w:val="24"/>
+                <w:szCs w:val="24"/>
+              </w:rPr>
+              <w:t>.03.31——完成论文定稿,自己在维普查重，文字重复率小于20%的论文可以参加答辩，并将所有与毕业论文有关的资料交给指导老师。</w:t>
             </w:r>
           </w:p>
         </w:tc>
@@ -1687,7 +1916,18 @@
           <w:sz w:val="24"/>
           <w:lang w:bidi="ar"/>
         </w:rPr>
-        <w:t xml:space="preserve">                </w:t>
+        <w:t xml:space="preserve">               </w:t>
+      </w:r>
+      <w:bookmarkStart w:id="0" w:name="_GoBack"/>
+      <w:bookmarkEnd w:id="0"/>
+      <w:r>
+        <w:rPr>
+          <w:rFonts w:asciiTheme="minorEastAsia" w:eastAsiaTheme="minorEastAsia" w:hAnsiTheme="minorEastAsia" w:cstheme="minorEastAsia" w:hint="eastAsia"/>
+          <w:kern w:val="0"/>
+          <w:sz w:val="24"/>
+          <w:lang w:bidi="ar"/>
+        </w:rPr>
+        <w:t xml:space="preserve"> </w:t>
       </w:r>
     </w:p>
     <w:sectPr>

</xml_diff>